<commit_message>
docs/future-improvements: add DMARC policy tightening item (MED)
Tighten the per-tenant DMARC TXT record at _dmarc.<domain> from p=none
("monitor, don't enforce") to p=quarantine, and eventually p=reject, after
mail deliverability is stable. Touch point: phase-pre-hetzner.sh.

https://claude.ai/code/session_01ALT9TuwoxVQbrz29G6DBLN
</commit_message>
<xml_diff>
--- a/docs/future-improvements.docx
+++ b/docs/future-improvements.docx
@@ -144,6 +144,19 @@
       </w:pPr>
       <w:r>
         <w:t>Improvements list</w:t>
+      </w:r>
+    </w:p>
+    <w:p>
+      <w:pPr>
+        <w:pStyle w:val="Heading2"/>
+      </w:pPr>
+      <w:r>
+        <w:t>DMARC policy: tighten from p=none to p=quarantine (or p=reject) — MED</w:t>
+      </w:r>
+    </w:p>
+    <w:p>
+      <w:r>
+        <w:t>After mail deliverability is verified stable at major recipients (Gmail, Outlook, etc.), tighten the per-tenant DMARC TXT record at _dmarc.&lt;domain&gt; from p=none ("monitor, don't enforce") to p=quarantine, and eventually p=reject. Enforcement causes recipient servers to junk/reject forged mail-from-&lt;domain&gt; instead of merely logging it. Touch points: the DMARC TXT value set by phase-pre-hetzner.sh; bump it per tenant once that tenant's outbound mail history is clean.</w:t>
       </w:r>
     </w:p>
     <w:tbl>

</xml_diff>